<commit_message>
chore: regenerate parity goldens on CI (#1)
Co-authored-by: I3eg1nner <45710049+I3eg1nner@users.noreply.github.com>
</commit_message>
<xml_diff>
--- a/test-markdown/__golden__/all-features.docx
+++ b/test-markdown/__golden__/all-features.docx
@@ -494,17 +494,6 @@
             </w:pPr>
             <w:r>
               <w:rPr>
-                <w:color w:val="475569"/>
-              </w:rPr>
-              <w:t xml:space="preserve">javascript</w:t>
-            </w:r>
-          </w:p>
-          <w:p>
-            <w:pPr>
-              <w:spacing w:lineRule="auto"/>
-            </w:pPr>
-            <w:r>
-              <w:rPr>
                 <w:color w:val="cf222e"/>
               </w:rPr>
               <w:t xml:space="preserve">function</w:t>
@@ -529,7 +518,7 @@
             </w:r>
             <w:r>
               <w:rPr>
-                <w:color w:val="24292f"/>
+                <w:color w:val="953800"/>
               </w:rPr>
               <w:t xml:space="preserve">name</w:t>
             </w:r>
@@ -570,7 +559,7 @@
             </w:r>
             <w:r>
               <w:rPr>
-                <w:color w:val="0a3069"/>
+                <w:color w:val="0550ae"/>
               </w:rPr>
               <w:t xml:space="preserve">${name}</w:t>
             </w:r>
@@ -758,17 +747,6 @@
             </w:pPr>
             <w:r>
               <w:rPr>
-                <w:color w:val="475569"/>
-              </w:rPr>
-              <w:t xml:space="preserve">python</w:t>
-            </w:r>
-          </w:p>
-          <w:p>
-            <w:pPr>
-              <w:spacing w:lineRule="auto"/>
-            </w:pPr>
-            <w:r>
-              <w:rPr>
                 <w:color w:val="cf222e"/>
               </w:rPr>
               <w:t xml:space="preserve">def</w:t>
@@ -793,7 +771,7 @@
             </w:r>
             <w:r>
               <w:rPr>
-                <w:color w:val="24292f"/>
+                <w:color w:val="953800"/>
               </w:rPr>
               <w:t xml:space="preserve">n: </w:t>
             </w:r>
@@ -1591,12 +1569,12 @@
           <wp:inline distB="0" distL="0" distR="0" distT="0">
             <wp:extent cx="9525" cy="9525"/>
             <wp:effectExtent b="0" l="0" r="0" t="0"/>
-            <wp:docPr id="1" name="image-lvdzsTQhP72kIqIP1jMVY.png"/>
+            <wp:docPr id="1" name="image-IfCQJ_tahQGVA8cuFajpk.png"/>
             <a:graphic>
               <a:graphicData uri="http://schemas.openxmlformats.org/drawingml/2006/picture">
                 <pic:pic>
                   <pic:nvPicPr>
-                    <pic:cNvPr id="1" name="image-lvdzsTQhP72kIqIP1jMVY.png" descr="Test image"/>
+                    <pic:cNvPr id="1" name="image-IfCQJ_tahQGVA8cuFajpk.png" descr="Test image"/>
                     <pic:cNvPicPr/>
                   </pic:nvPicPr>
                   <pic:blipFill>
@@ -1650,12 +1628,12 @@
           <wp:inline distB="0" distL="0" distR="0" distT="0">
             <wp:extent cx="2333625" cy="4733925"/>
             <wp:effectExtent b="0" l="0" r="0" t="0"/>
-            <wp:docPr id="3" name="image-H7A5eHymviqh5RGkIoPFI.png"/>
+            <wp:docPr id="3" name="image-dd44pyMe2yOUPGwlm5Zqn.png"/>
             <a:graphic>
               <a:graphicData uri="http://schemas.openxmlformats.org/drawingml/2006/picture">
                 <pic:pic>
                   <pic:nvPicPr>
-                    <pic:cNvPr id="3" name="image-H7A5eHymviqh5RGkIoPFI.png" descr="Mermaid diagram 1"/>
+                    <pic:cNvPr id="3" name="image-dd44pyMe2yOUPGwlm5Zqn.png" descr="Mermaid diagram 1"/>
                     <pic:cNvPicPr/>
                   </pic:nvPicPr>
                   <pic:blipFill>
@@ -1699,12 +1677,12 @@
           <wp:inline distB="0" distL="0" distR="0" distT="0">
             <wp:extent cx="6410325" cy="5876925"/>
             <wp:effectExtent b="0" l="0" r="0" t="0"/>
-            <wp:docPr id="5" name="image-QDwUGACisZTCgLNTePhpP.png"/>
+            <wp:docPr id="5" name="image-9dHGy-EqP2CyXCrDJg38P.png"/>
             <a:graphic>
               <a:graphicData uri="http://schemas.openxmlformats.org/drawingml/2006/picture">
                 <pic:pic>
                   <pic:nvPicPr>
-                    <pic:cNvPr id="5" name="image-QDwUGACisZTCgLNTePhpP.png" descr="Mermaid diagram 2"/>
+                    <pic:cNvPr id="5" name="image-9dHGy-EqP2CyXCrDJg38P.png" descr="Mermaid diagram 2"/>
                     <pic:cNvPicPr/>
                   </pic:nvPicPr>
                   <pic:blipFill>
@@ -1850,17 +1828,6 @@
               <w:right w:val="single" w:sz="8" w:space="0" w:color="D1D5DB"/>
             </w:tcBorders>
           </w:tcPr>
-          <w:p>
-            <w:pPr>
-              <w:spacing w:lineRule="auto"/>
-            </w:pPr>
-            <w:r>
-              <w:rPr>
-                <w:color w:val="475569"/>
-              </w:rPr>
-              <w:t xml:space="preserve">bash</w:t>
-            </w:r>
-          </w:p>
           <w:p>
             <w:pPr>
               <w:spacing w:lineRule="auto"/>

</xml_diff>